<commit_message>
Tolong revisi kembali sesuai catata
</commit_message>
<xml_diff>
--- a/kelompok 3 ragam dialog/BAB 4 RAGAM DIALOG revisi terbaru.docx
+++ b/kelompok 3 ragam dialog/BAB 4 RAGAM DIALOG revisi terbaru.docx
@@ -13,6 +13,7 @@
           <w:szCs w:val="40"/>
         </w:rPr>
       </w:pPr>
+      <w:commentRangeStart w:id="0"/>
       <w:r>
         <w:rPr>
           <w:rFonts w:eastAsia="Calibri"/>
@@ -41,6 +42,13 @@
         </w:rPr>
         <w:t>RAGAM DIALOG</w:t>
       </w:r>
+      <w:commentRangeEnd w:id="0"/>
+      <w:r>
+        <w:rPr>
+          <w:rStyle w:val="CommentReference"/>
+        </w:rPr>
+        <w:commentReference w:id="0"/>
+      </w:r>
     </w:p>
     <w:p>
       <w:pPr>
@@ -83,7 +91,15 @@
         <w:ind w:left="14" w:right="6"/>
       </w:pPr>
       <w:r>
-        <w:t xml:space="preserve">Berbagai teknik dialog interaktif yang memungkinkan terjadinya komunikasi antara manusia dengan komputer pada dewasa ini cukup bervariasi, dimulai dari yang sederhana sampai yang cukup canggih(Lestari, 2019). Beberapa di antaranya adalah sistem menu, dialog berbasis pengisian borang, kursor yang bergerak, pelacak simbol yang dapat di program, ikon, jendela, penggulung teks, dan daftarnya masih cukup banyak lagi. Salah satu tujuan dari bab ini adalah menyajikan dan mendiskusikan berbagai teknik dialog yang ada dan untuk mengidentifikasikan beberapa kekuatan dan kelemahan dari setiap teknik dialog yang akan disajikan (Santoso, 2009). </w:t>
+        <w:t xml:space="preserve">Berbagai teknik dialog interaktif yang memungkinkan terjadinya komunikasi antara manusia dengan komputer pada dewasa ini cukup bervariasi, dimulai dari yang sederhana sampai yang cukup </w:t>
+      </w:r>
+      <w:proofErr w:type="gramStart"/>
+      <w:r>
+        <w:t>canggih(</w:t>
+      </w:r>
+      <w:proofErr w:type="gramEnd"/>
+      <w:r>
+        <w:t xml:space="preserve">Lestari, 2019). Beberapa di antaranya adalah sistem menu, dialog berbasis pengisian borang, kursor yang bergerak, pelacak simbol yang dapat di program, ikon, jendela, penggulung teks, dan daftarnya masih cukup banyak lagi. Salah satu tujuan dari bab ini adalah menyajikan dan mendiskusikan berbagai teknik dialog yang ada dan untuk mengidentifikasikan beberapa kekuatan dan kelemahan dari setiap teknik dialog yang akan disajikan (Santoso, 2009). </w:t>
       </w:r>
     </w:p>
     <w:p>
@@ -107,12 +123,12 @@
     </w:p>
     <w:p>
       <w:pPr>
-        <w:pStyle w:val="Judul1"/>
+        <w:pStyle w:val="Heading1"/>
         <w:spacing w:after="3" w:line="262" w:lineRule="auto"/>
         <w:ind w:left="5" w:right="4" w:hanging="10"/>
         <w:jc w:val="left"/>
       </w:pPr>
-      <w:bookmarkStart w:id="0" w:name="_Toc78727"/>
+      <w:bookmarkStart w:id="1" w:name="_Toc78727"/>
       <w:r>
         <w:rPr>
           <w:rFonts w:ascii="Calibri" w:eastAsia="Calibri" w:hAnsi="Calibri" w:cs="Calibri"/>
@@ -121,7 +137,7 @@
         <w:lastRenderedPageBreak/>
         <w:t xml:space="preserve">4.2 Apa itu Ragam Dialog </w:t>
       </w:r>
-      <w:bookmarkEnd w:id="0"/>
+      <w:bookmarkEnd w:id="1"/>
     </w:p>
     <w:p>
       <w:pPr>
@@ -129,7 +145,15 @@
         <w:ind w:left="14" w:right="6"/>
       </w:pPr>
       <w:r>
-        <w:t xml:space="preserve">Secara umum, dialog merupakan proses komunikasi antara 2 atau lebih agen, dalam dialgo makna harus dipertimbangkan agar memenuhi kaidah semantic dan pragmatis. Sedangkan dalam secara IMK, dialog merupakan pertukaran instruksi dan informasi yang mengambil tempat antara user dan sistem komputer. Ragam dialog bisa diartikan sebagai proses pertukaran komunikasi antara satu atau lebih dalam mengambil kaidah informasi dalam user dan sistem komputer. </w:t>
+        <w:t xml:space="preserve">Secara umum, dialog merupakan proses komunikasi antara 2 atau lebih agen, dalam dialgo makna harus dipertimbangkan agar memenuhi kaidah semantic dan pragmatis. Sedangkan dalam secara IMK, dialog merupakan pertukaran instruksi dan informasi yang mengambil tempat antara user dan sistem komputer. Ragam dialog bisa diartikan sebagai </w:t>
+      </w:r>
+      <w:proofErr w:type="gramStart"/>
+      <w:r>
+        <w:t>proses</w:t>
+      </w:r>
+      <w:proofErr w:type="gramEnd"/>
+      <w:r>
+        <w:t xml:space="preserve"> pertukaran komunikasi antara satu atau lebih dalam mengambil kaidah informasi dalam user dan sistem komputer. </w:t>
       </w:r>
     </w:p>
     <w:p>
@@ -138,7 +162,21 @@
         <w:ind w:left="14" w:right="6"/>
       </w:pPr>
       <w:r>
-        <w:t xml:space="preserve">Tujuan dibuatnya Ragam dialog pada IMK adalah ”Untuk menyajikan dan mendiskusikan berbagai teknik dialog yang ada dan untuk mengidentifikasikan beberapa kekuatan dan kelemahan dari setiap teknik dialog yang akan disajikan : ” </w:t>
+        <w:t xml:space="preserve">Tujuan dibuatnya Ragam dialog pada IMK </w:t>
+      </w:r>
+      <w:r>
+        <w:t>adalah” Untuk</w:t>
+      </w:r>
+      <w:r>
+        <w:t xml:space="preserve"> menyajikan dan mendiskusikan berbagai teknik dialog yang ada dan untuk mengidentifikasikan beberapa kekuatan dan kelemahan dari setiap teknik dialog yang akan disajikan</w:t>
+      </w:r>
+      <w:proofErr w:type="gramStart"/>
+      <w:r>
+        <w:t>: ”</w:t>
+      </w:r>
+      <w:proofErr w:type="gramEnd"/>
+      <w:r>
+        <w:t xml:space="preserve"> </w:t>
       </w:r>
     </w:p>
     <w:p>
@@ -160,7 +198,16 @@
         <w:ind w:right="6" w:hanging="360"/>
       </w:pPr>
       <w:r>
-        <w:t xml:space="preserve">Diagramatik : State transition networks ( jaringan transisi kondisi atau status ), flow charts ( diagram alir ), diagram JSD. </w:t>
+        <w:t>Diagramatik:</w:t>
+      </w:r>
+      <w:r>
+        <w:t xml:space="preserve"> State transition networks (jaringan transisi kondisi atau status), flow charts (diagram </w:t>
+      </w:r>
+      <w:r>
+        <w:t>alir)</w:t>
+      </w:r>
+      <w:r>
+        <w:t xml:space="preserve">, diagram JSD. </w:t>
       </w:r>
     </w:p>
     <w:p>
@@ -173,7 +220,40 @@
         <w:ind w:right="6" w:hanging="360"/>
       </w:pPr>
       <w:r>
-        <w:t xml:space="preserve">Tekstual : Formal grammars  ( tata bahasa formal ) , Production rules ( aturan produksi ), dan CSP. </w:t>
+        <w:t>Tekstual:</w:t>
+      </w:r>
+      <w:r>
+        <w:t xml:space="preserve"> Formal </w:t>
+      </w:r>
+      <w:r>
+        <w:t>grammars (tata</w:t>
+      </w:r>
+      <w:r>
+        <w:t xml:space="preserve"> bahasa formal</w:t>
+      </w:r>
+      <w:proofErr w:type="gramStart"/>
+      <w:r>
+        <w:t>) ,</w:t>
+      </w:r>
+      <w:proofErr w:type="gramEnd"/>
+      <w:r>
+        <w:t xml:space="preserve"> Production rules </w:t>
+      </w:r>
+      <w:proofErr w:type="gramStart"/>
+      <w:r>
+        <w:t>( aturan</w:t>
+      </w:r>
+      <w:proofErr w:type="gramEnd"/>
+      <w:r>
+        <w:t xml:space="preserve"> </w:t>
+      </w:r>
+      <w:proofErr w:type="gramStart"/>
+      <w:r>
+        <w:t>produksi )</w:t>
+      </w:r>
+      <w:proofErr w:type="gramEnd"/>
+      <w:r>
+        <w:t xml:space="preserve">, dan CSP. </w:t>
       </w:r>
     </w:p>
     <w:p>
@@ -182,7 +262,15 @@
         <w:ind w:left="14" w:right="6"/>
       </w:pPr>
       <w:r>
-        <w:t xml:space="preserve">Beberapa sifat penting yang perlu dimiliki oleh setiap Ragam Dialog : </w:t>
+        <w:t xml:space="preserve">Beberapa sifat penting yang perlu dimiliki oleh setiap Ragam </w:t>
+      </w:r>
+      <w:proofErr w:type="gramStart"/>
+      <w:r>
+        <w:t>Dialog :</w:t>
+      </w:r>
+      <w:proofErr w:type="gramEnd"/>
+      <w:r>
+        <w:t xml:space="preserve"> </w:t>
       </w:r>
     </w:p>
     <w:p>
@@ -207,9 +295,9 @@
         <w:spacing w:after="201" w:line="259" w:lineRule="auto"/>
         <w:ind w:right="0"/>
         <w:sectPr>
-          <w:headerReference w:type="even" r:id="rId7"/>
-          <w:headerReference w:type="default" r:id="rId8"/>
-          <w:headerReference w:type="first" r:id="rId9"/>
+          <w:headerReference w:type="even" r:id="rId12"/>
+          <w:headerReference w:type="default" r:id="rId13"/>
+          <w:headerReference w:type="first" r:id="rId14"/>
           <w:pgSz w:w="9184" w:h="12983"/>
           <w:pgMar w:top="1596" w:right="1339" w:bottom="1072" w:left="1307" w:header="720" w:footer="720" w:gutter="0"/>
           <w:cols w:space="720"/>
@@ -228,10 +316,16 @@
         <w:t xml:space="preserve">n </w:t>
       </w:r>
       <w:r>
-        <w:t>oleh komputer untuk memasukkan perintah atau parameter perintah.</w:t>
-      </w:r>
-      <w:r>
-        <w:t>Inisiatif oleh komputer, pengguna</w:t>
+        <w:t xml:space="preserve">oleh komputer untuk memasukkan perintah atau parameter </w:t>
+      </w:r>
+      <w:r>
+        <w:t>perintah.</w:t>
+      </w:r>
+      <w:r>
+        <w:t xml:space="preserve"> Inisiatif</w:t>
+      </w:r>
+      <w:r>
+        <w:t xml:space="preserve"> oleh komputer, pengguna</w:t>
       </w:r>
     </w:p>
     <w:p>
@@ -245,7 +339,31 @@
         <w:ind w:left="14" w:right="6"/>
       </w:pPr>
       <w:r>
-        <w:t xml:space="preserve">memberikan tanggapan atas araha dari komputer. Definisi himpunan yang ditetapkan sebelumnya contoh : Yes/No. Sebaliknya, inisiatif oleh pengguna, mempunyai sifat keterbukaan yang lebih luas : pengguna diharapkan memahami sekumpulan perintah yang harus di tulis menurut aturan (sintaks) tertentu. Contoh : command line. </w:t>
+        <w:t xml:space="preserve">memberikan tanggapan atas araha dari komputer. Definisi himpunan yang ditetapkan sebelumnya </w:t>
+      </w:r>
+      <w:proofErr w:type="gramStart"/>
+      <w:r>
+        <w:t>contoh :</w:t>
+      </w:r>
+      <w:proofErr w:type="gramEnd"/>
+      <w:r>
+        <w:t xml:space="preserve"> Yes/No. Sebaliknya, inisiatif oleh pengguna, mempunyai sifat keterbukaan yang lebih </w:t>
+      </w:r>
+      <w:proofErr w:type="gramStart"/>
+      <w:r>
+        <w:t>luas :</w:t>
+      </w:r>
+      <w:proofErr w:type="gramEnd"/>
+      <w:r>
+        <w:t xml:space="preserve"> pengguna diharapkan memahami sekumpulan perintah yang harus di tulis menurut aturan (sintaks) tertentu. </w:t>
+      </w:r>
+      <w:proofErr w:type="gramStart"/>
+      <w:r>
+        <w:t>Contoh :</w:t>
+      </w:r>
+      <w:proofErr w:type="gramEnd"/>
+      <w:r>
+        <w:t xml:space="preserve"> command line. </w:t>
       </w:r>
     </w:p>
     <w:p>
@@ -338,15 +456,15 @@
     </w:p>
     <w:p>
       <w:pPr>
-        <w:pStyle w:val="Judul2"/>
+        <w:pStyle w:val="Heading2"/>
         <w:ind w:left="-5"/>
       </w:pPr>
-      <w:bookmarkStart w:id="1" w:name="_Toc78728"/>
+      <w:bookmarkStart w:id="2" w:name="_Toc78728"/>
       <w:r>
         <w:lastRenderedPageBreak/>
         <w:t xml:space="preserve">4.2.1 Karakteristik Ragam Dialog </w:t>
       </w:r>
-      <w:bookmarkEnd w:id="1"/>
+      <w:bookmarkEnd w:id="2"/>
     </w:p>
     <w:p>
       <w:pPr>
@@ -354,7 +472,15 @@
         <w:ind w:left="14" w:right="6"/>
       </w:pPr>
       <w:r>
-        <w:t xml:space="preserve">Selain sifat – sifat diatas, maka dapat di tambahkan karateristik ragam dialog yang lainnya, sebagai berikut : </w:t>
+        <w:t xml:space="preserve">Selain sifat – sifat diatas, maka dapat di tambahkan karateristik ragam dialog yang lainnya, sebagai </w:t>
+      </w:r>
+      <w:proofErr w:type="gramStart"/>
+      <w:r>
+        <w:t>berikut :</w:t>
+      </w:r>
+      <w:proofErr w:type="gramEnd"/>
+      <w:r>
+        <w:t xml:space="preserve"> </w:t>
       </w:r>
     </w:p>
     <w:p>
@@ -494,14 +620,14 @@
     </w:p>
     <w:p>
       <w:pPr>
-        <w:pStyle w:val="Judul3"/>
+        <w:pStyle w:val="Heading3"/>
         <w:ind w:left="-5"/>
       </w:pPr>
-      <w:bookmarkStart w:id="2" w:name="_Toc78729"/>
+      <w:bookmarkStart w:id="3" w:name="_Toc78729"/>
       <w:r>
         <w:t xml:space="preserve">4.2.2 Kategori Ragam Dialog </w:t>
       </w:r>
-      <w:bookmarkEnd w:id="2"/>
+      <w:bookmarkEnd w:id="3"/>
     </w:p>
     <w:p>
       <w:pPr>
@@ -509,7 +635,15 @@
         <w:ind w:left="14" w:right="6"/>
       </w:pPr>
       <w:r>
-        <w:t xml:space="preserve">Ragam dialog interaktif dapat di kelompokkkan menjadi 9 kategori : </w:t>
+        <w:t xml:space="preserve">Ragam dialog interaktif dapat di kelompokkkan menjadi 9 </w:t>
+      </w:r>
+      <w:proofErr w:type="gramStart"/>
+      <w:r>
+        <w:t>kategori :</w:t>
+      </w:r>
+      <w:proofErr w:type="gramEnd"/>
+      <w:r>
+        <w:t xml:space="preserve"> </w:t>
       </w:r>
     </w:p>
     <w:p>
@@ -527,7 +661,15 @@
         <w:t xml:space="preserve"> </w:t>
       </w:r>
       <w:r>
-        <w:t xml:space="preserve">Dialog berbasis perintah tunggal ( Command line dialogue)  </w:t>
+        <w:t xml:space="preserve">Dialog berbasis perintah tunggal </w:t>
+      </w:r>
+      <w:proofErr w:type="gramStart"/>
+      <w:r>
+        <w:t>( Command</w:t>
+      </w:r>
+      <w:proofErr w:type="gramEnd"/>
+      <w:r>
+        <w:t xml:space="preserve"> line dialogue)  </w:t>
       </w:r>
     </w:p>
     <w:p>
@@ -536,7 +678,55 @@
         <w:ind w:left="14" w:right="6"/>
       </w:pPr>
       <w:r>
-        <w:t>Dialog berbasis perintah tunggal ( command line dialogue ) adalah ragam yang paling  konvensional. Perintah – perintah tunggal yang dapat di operasikan biasanya bergantung dari sistem komputer yang dipakai, dan berada dalam suatu domain yang disebut bahasa perintah ( command language ). Bahasa perintah harus dirancang sedemikian rupa sehingga mereka mempunyai sifat alamiah, yakni mudah dipelajari dan diingat oleh kebanyakan pengguna. Meskipun bersifat buatan, bahasa buatan ini tetap mempunyai struktur leksikal, sintaksis dan semantik tertentu. Adapun keuntungan dari penggunaan dialog berbasis perintah tunggal, yaitu : a.</w:t>
+        <w:t xml:space="preserve">Dialog berbasis perintah tunggal </w:t>
+      </w:r>
+      <w:proofErr w:type="gramStart"/>
+      <w:r>
+        <w:t>( command</w:t>
+      </w:r>
+      <w:proofErr w:type="gramEnd"/>
+      <w:r>
+        <w:t xml:space="preserve"> line </w:t>
+      </w:r>
+      <w:proofErr w:type="gramStart"/>
+      <w:r>
+        <w:t>dialogue )</w:t>
+      </w:r>
+      <w:proofErr w:type="gramEnd"/>
+      <w:r>
+        <w:t xml:space="preserve"> adalah ragam yang </w:t>
+      </w:r>
+      <w:proofErr w:type="gramStart"/>
+      <w:r>
+        <w:t>paling  konvensional</w:t>
+      </w:r>
+      <w:proofErr w:type="gramEnd"/>
+      <w:r>
+        <w:t xml:space="preserve">. Perintah – perintah tunggal yang dapat di operasikan biasanya bergantung dari sistem komputer yang dipakai, dan berada dalam suatu domain yang disebut bahasa perintah </w:t>
+      </w:r>
+      <w:proofErr w:type="gramStart"/>
+      <w:r>
+        <w:t>( command</w:t>
+      </w:r>
+      <w:proofErr w:type="gramEnd"/>
+      <w:r>
+        <w:t xml:space="preserve"> </w:t>
+      </w:r>
+      <w:proofErr w:type="gramStart"/>
+      <w:r>
+        <w:t>language )</w:t>
+      </w:r>
+      <w:proofErr w:type="gramEnd"/>
+      <w:r>
+        <w:t xml:space="preserve">. Bahasa perintah harus dirancang sedemikian rupa sehingga mereka mempunyai sifat alamiah, yakni mudah dipelajari dan diingat oleh kebanyakan pengguna. Meskipun bersifat buatan, bahasa buatan ini tetap mempunyai struktur leksikal, sintaksis dan semantik tertentu. Adapun keuntungan dari penggunaan dialog berbasis perintah tunggal, </w:t>
+      </w:r>
+      <w:proofErr w:type="gramStart"/>
+      <w:r>
+        <w:t>yaitu :</w:t>
+      </w:r>
+      <w:proofErr w:type="gramEnd"/>
+      <w:r>
+        <w:t xml:space="preserve"> a.</w:t>
       </w:r>
       <w:r>
         <w:rPr>
@@ -618,7 +808,15 @@
         <w:ind w:left="14" w:right="6"/>
       </w:pPr>
       <w:r>
-        <w:t xml:space="preserve">Sedangkan untuk kelemahan dari penggunaan dialog berbasis perintah tunggal, yaitu :  </w:t>
+        <w:t xml:space="preserve">Sedangkan untuk kelemahan dari penggunaan dialog berbasis perintah tunggal, </w:t>
+      </w:r>
+      <w:proofErr w:type="gramStart"/>
+      <w:r>
+        <w:t>yaitu :</w:t>
+      </w:r>
+      <w:proofErr w:type="gramEnd"/>
+      <w:r>
+        <w:t xml:space="preserve">  </w:t>
       </w:r>
     </w:p>
     <w:p>
@@ -699,7 +897,7 @@
                     <pic:cNvPicPr/>
                   </pic:nvPicPr>
                   <pic:blipFill>
-                    <a:blip r:embed="rId10"/>
+                    <a:blip r:embed="rId15"/>
                     <a:stretch>
                       <a:fillRect/>
                     </a:stretch>
@@ -735,14 +933,20 @@
       <w:r>
         <w:t xml:space="preserve"> </w:t>
       </w:r>
-      <w:commentRangeStart w:id="3"/>
       <w:commentRangeStart w:id="4"/>
-      <w:r>
-        <w:t>Contoh penggunaan perintah tunggal pada CMD(</w:t>
+      <w:commentRangeStart w:id="5"/>
+      <w:commentRangeStart w:id="6"/>
+      <w:r>
+        <w:t xml:space="preserve">Contoh penggunaan perintah tunggal pada </w:t>
+      </w:r>
+      <w:proofErr w:type="gramStart"/>
+      <w:r>
+        <w:t>CMD(</w:t>
       </w:r>
       <w:r>
         <w:t>Imanuel,Fridolf</w:t>
       </w:r>
+      <w:proofErr w:type="gramEnd"/>
       <w:r>
         <w:t>, 2</w:t>
       </w:r>
@@ -752,19 +956,26 @@
       <w:r>
         <w:t>)</w:t>
       </w:r>
-      <w:commentRangeEnd w:id="3"/>
+      <w:commentRangeEnd w:id="4"/>
       <w:r>
         <w:rPr>
-          <w:rStyle w:val="ReferensiKomentar"/>
-        </w:rPr>
-        <w:commentReference w:id="3"/>
-      </w:r>
-      <w:commentRangeEnd w:id="4"/>
-      <w:r>
-        <w:rPr>
-          <w:rStyle w:val="ReferensiKomentar"/>
+          <w:rStyle w:val="CommentReference"/>
         </w:rPr>
         <w:commentReference w:id="4"/>
+      </w:r>
+      <w:commentRangeEnd w:id="5"/>
+      <w:r>
+        <w:rPr>
+          <w:rStyle w:val="CommentReference"/>
+        </w:rPr>
+        <w:commentReference w:id="5"/>
+      </w:r>
+      <w:commentRangeEnd w:id="6"/>
+      <w:r>
+        <w:rPr>
+          <w:rStyle w:val="CommentReference"/>
+        </w:rPr>
+        <w:commentReference w:id="6"/>
       </w:r>
     </w:p>
     <w:p>
@@ -777,7 +988,15 @@
         <w:ind w:right="6" w:hanging="360"/>
       </w:pPr>
       <w:r>
-        <w:t xml:space="preserve">Dialog berbasis bahasa pemrograman ( Programming language dialogue) </w:t>
+        <w:t xml:space="preserve">Dialog berbasis bahasa pemrograman </w:t>
+      </w:r>
+      <w:proofErr w:type="gramStart"/>
+      <w:r>
+        <w:t>( Programming</w:t>
+      </w:r>
+      <w:proofErr w:type="gramEnd"/>
+      <w:r>
+        <w:t xml:space="preserve"> language dialogue) </w:t>
       </w:r>
     </w:p>
     <w:p>
@@ -786,7 +1005,15 @@
         <w:ind w:left="14" w:right="6"/>
       </w:pPr>
       <w:r>
-        <w:t xml:space="preserve">Dialog berbasis bahasa pemrograman merupakan ragam dialog yang memungkinkan pengguna untuk mengemas sejumlah perintah kedalam suatu bentuk berkas (file) yang sering disebut dengan batch file. Dalam keadaan tertentu, penggunaan dialog berbasis perintah tunggal sering tidak memadai, khususnya ketika pengguna harus memberikan sederetan perintah – perintah yang sama setiap kali ia menjalankan program aplikasi tersebut. Contohnya : Pascal, Assembler, C, FORTRAN, atau BASIC.  </w:t>
+        <w:t xml:space="preserve">Dialog berbasis bahasa pemrograman merupakan ragam dialog yang memungkinkan pengguna untuk mengemas sejumlah perintah kedalam suatu bentuk berkas (file) yang sering disebut dengan batch file. Dalam keadaan tertentu, penggunaan dialog berbasis perintah tunggal sering tidak memadai, khususnya ketika pengguna harus memberikan sederetan perintah – perintah yang sama setiap kali ia menjalankan program aplikasi tersebut. </w:t>
+      </w:r>
+      <w:proofErr w:type="gramStart"/>
+      <w:r>
+        <w:t>Contohnya :</w:t>
+      </w:r>
+      <w:proofErr w:type="gramEnd"/>
+      <w:r>
+        <w:t xml:space="preserve"> Pascal, Assembler, C, FORTRAN, atau BASIC.  </w:t>
       </w:r>
     </w:p>
     <w:p>
@@ -799,7 +1026,15 @@
         <w:ind w:right="6" w:hanging="360"/>
       </w:pPr>
       <w:r>
-        <w:t xml:space="preserve">Dialog berbasis pengisian formulir ( Form filling dialogue) </w:t>
+        <w:t xml:space="preserve">Dialog berbasis pengisian formulir </w:t>
+      </w:r>
+      <w:proofErr w:type="gramStart"/>
+      <w:r>
+        <w:t>( Form</w:t>
+      </w:r>
+      <w:proofErr w:type="gramEnd"/>
+      <w:r>
+        <w:t xml:space="preserve"> filling dialogue) </w:t>
       </w:r>
     </w:p>
     <w:p>
@@ -808,7 +1043,23 @@
         <w:ind w:left="14" w:right="6"/>
       </w:pPr>
       <w:r>
-        <w:t xml:space="preserve">Dialog di mana pengguna(user) dihadapkan ke suatu bentuk formulir dilayar komputer yang berisi sejumlah pengisian data dan opsi ( option) yang telah ditentukan. Sebagai dasar untuk pendataan Layar berbentyuk formulir. Data diinputkan pada kolom – kolom yang telah tersedia. Perlu rancangan yang baik dan ada fasilitas perbaikan ( Koreksi ).  </w:t>
+        <w:t xml:space="preserve">Dialog di mana pengguna(user) dihadapkan ke suatu bentuk formulir dilayar komputer yang berisi sejumlah pengisian data dan opsi </w:t>
+      </w:r>
+      <w:proofErr w:type="gramStart"/>
+      <w:r>
+        <w:t>( option</w:t>
+      </w:r>
+      <w:proofErr w:type="gramEnd"/>
+      <w:r>
+        <w:t xml:space="preserve">) yang telah ditentukan. Sebagai dasar untuk pendataan Layar berbentyuk formulir. Data diinputkan pada kolom – kolom yang telah tersedia. Perlu rancangan yang baik dan ada fasilitas perbaikan </w:t>
+      </w:r>
+      <w:proofErr w:type="gramStart"/>
+      <w:r>
+        <w:t>( Koreksi</w:t>
+      </w:r>
+      <w:proofErr w:type="gramEnd"/>
+      <w:r>
+        <w:t xml:space="preserve"> ).  </w:t>
       </w:r>
     </w:p>
     <w:p>
@@ -831,7 +1082,15 @@
       </w:pPr>
       <w:r>
         <w:lastRenderedPageBreak/>
-        <w:t xml:space="preserve">Sistem menu merupakan pilihan yang tepat untuk menunjukkan kemampuan dan fasilitas yang dimilikioleh sebuah program aplikasi kepada pengguna. Menu adalah daftar sejumlah pilihan dalam jumlah terbatas, yang biasanya berupa suatu kalimat atau kumpulan beberapa kata. Di tinjau dari teknik penampilan pilihan – pilihan pada sebuah sistem menu. Terdapat 2(dua) jenis sistem menu : </w:t>
+        <w:t xml:space="preserve">Sistem menu merupakan pilihan yang tepat untuk menunjukkan kemampuan dan fasilitas yang dimilikioleh sebuah program aplikasi kepada pengguna. Menu adalah daftar sejumlah pilihan dalam jumlah terbatas, yang biasanya berupa suatu kalimat atau kumpulan beberapa kata. Di tinjau dari teknik penampilan pilihan – pilihan pada sebuah sistem menu. Terdapat 2(dua) jenis sistem </w:t>
+      </w:r>
+      <w:proofErr w:type="gramStart"/>
+      <w:r>
+        <w:t>menu :</w:t>
+      </w:r>
+      <w:proofErr w:type="gramEnd"/>
+      <w:r>
+        <w:t xml:space="preserve"> </w:t>
       </w:r>
     </w:p>
     <w:p>
@@ -875,7 +1134,47 @@
         <w:ind w:left="14" w:right="6"/>
       </w:pPr>
       <w:r>
-        <w:t xml:space="preserve">Sistem menu datar adalah sistem menu yang menampilkan semua pilihan secara lengkap. Dalam menentukan jenis selektor yang akan digunakan (angka, huruf atau kombinasinya ) salah satu bahan pertimbangannya adalah banyaknya pilihan yang akan disediakan. Penggunaan selektor yang berupa angka ( tidak termasuk angka10 ). Tetapi jika jumlah pilihan lebih dari 10 buah, penggunaan selektor yang berupa angka kurang cocok, karena pengguna harus menekan dua buah tomboluntuk memilih pilihan dengan nomor elektor 10 atau lebih. Keadaan seperti ini tidak selalu diinginkan, bagi pengguna. Jika menggunakan selektor berupa huruf, karena kita mempunyai 26 huruf alphabet, jika cacah pilihan lebih besar dari 26 buah, selektornya dapat berupa campuran angka dan huruf. b. Penggunaan Tanda Terang ( highlight marker ) </w:t>
+        <w:t xml:space="preserve">Sistem menu datar adalah sistem menu yang menampilkan semua pilihan secara lengkap. Dalam menentukan jenis selektor yang akan digunakan (angka, huruf atau </w:t>
+      </w:r>
+      <w:proofErr w:type="gramStart"/>
+      <w:r>
+        <w:t>kombinasinya )</w:t>
+      </w:r>
+      <w:proofErr w:type="gramEnd"/>
+      <w:r>
+        <w:t xml:space="preserve"> salah satu bahan pertimbangannya adalah banyaknya pilihan yang akan disediakan. Penggunaan selektor yang berupa angka </w:t>
+      </w:r>
+      <w:proofErr w:type="gramStart"/>
+      <w:r>
+        <w:t>( tidak</w:t>
+      </w:r>
+      <w:proofErr w:type="gramEnd"/>
+      <w:r>
+        <w:t xml:space="preserve"> termasuk angka</w:t>
+      </w:r>
+      <w:proofErr w:type="gramStart"/>
+      <w:r>
+        <w:t>10 )</w:t>
+      </w:r>
+      <w:proofErr w:type="gramEnd"/>
+      <w:r>
+        <w:t xml:space="preserve">. Tetapi jika jumlah pilihan lebih dari 10 buah, penggunaan selektor yang berupa angka kurang cocok, karena pengguna harus menekan dua buah tomboluntuk memilih pilihan dengan nomor elektor 10 atau lebih. Keadaan seperti ini tidak selalu diinginkan, bagi pengguna. Jika menggunakan selektor berupa huruf, karena kita mempunyai 26 huruf alphabet, jika cacah pilihan lebih besar dari 26 buah, selektornya dapat berupa campuran angka dan huruf. b. Penggunaan Tanda Terang </w:t>
+      </w:r>
+      <w:proofErr w:type="gramStart"/>
+      <w:r>
+        <w:t>( highlight</w:t>
+      </w:r>
+      <w:proofErr w:type="gramEnd"/>
+      <w:r>
+        <w:t xml:space="preserve"> </w:t>
+      </w:r>
+      <w:proofErr w:type="gramStart"/>
+      <w:r>
+        <w:t>marker )</w:t>
+      </w:r>
+      <w:proofErr w:type="gramEnd"/>
+      <w:r>
+        <w:t xml:space="preserve"> </w:t>
       </w:r>
     </w:p>
     <w:p>
@@ -884,7 +1183,23 @@
         <w:ind w:left="14" w:right="6"/>
       </w:pPr>
       <w:r>
-        <w:t>Cara lain untuk menentukan pilihan pada daftar menu datar adalah menggunakan suatu mekanisme yang disebut tanda terang ( highlight marker ) yang dapat digerakkan pada semua pilihan yang ada dilayar. Dengan cara ini, pengguna – dengan bantuan tombol khusus seperti __, -, --, atau dengan menggunakan mouse – menempatkan tanda terang ke suatyu pilihan yang ia inginkan. Kemudian, pengguna harus menekan tombol enter atau mengKlik mouse untuk mengkonfirmasikan pilihannya.</w:t>
+        <w:t xml:space="preserve">Cara lain untuk menentukan pilihan pada daftar menu datar adalah menggunakan suatu mekanisme yang disebut tanda terang </w:t>
+      </w:r>
+      <w:proofErr w:type="gramStart"/>
+      <w:r>
+        <w:t>( highlight</w:t>
+      </w:r>
+      <w:proofErr w:type="gramEnd"/>
+      <w:r>
+        <w:t xml:space="preserve"> </w:t>
+      </w:r>
+      <w:proofErr w:type="gramStart"/>
+      <w:r>
+        <w:t>marker )</w:t>
+      </w:r>
+      <w:proofErr w:type="gramEnd"/>
+      <w:r>
+        <w:t xml:space="preserve"> yang dapat digerakkan pada semua pilihan yang ada dilayar. Dengan cara ini, pengguna – dengan bantuan tombol khusus seperti __, -, --, atau dengan menggunakan mouse – menempatkan tanda terang ke suatyu pilihan yang ia inginkan. Kemudian, pengguna harus menekan tombol enter atau mengKlik mouse untuk mengkonfirmasikan pilihannya.</w:t>
       </w:r>
     </w:p>
     <w:p>
@@ -930,7 +1245,39 @@
         <w:t xml:space="preserve"> </w:t>
       </w:r>
       <w:r>
-        <w:t xml:space="preserve">Sistem menu tarik ( pulldown) yang berbasis pada struktur hirarki pilihan ( struktur pohon pilihan ). Sistem menu tarik adalah sistem menu yang akan menampilkan pilihan dalam kelompok – kelompok tertentu. Pada sebuah sub pilihan/submenu dari suatu pilihan/menu utama dapat mempunyai satu atau lebih sub – sub pilihan, dan seterusnya. Contoh sistem menu tarik ( pulldown ). </w:t>
+        <w:t xml:space="preserve">Sistem menu tarik </w:t>
+      </w:r>
+      <w:proofErr w:type="gramStart"/>
+      <w:r>
+        <w:t>( pulldown</w:t>
+      </w:r>
+      <w:proofErr w:type="gramEnd"/>
+      <w:r>
+        <w:t xml:space="preserve">) yang berbasis pada struktur hirarki pilihan </w:t>
+      </w:r>
+      <w:proofErr w:type="gramStart"/>
+      <w:r>
+        <w:t>( struktur</w:t>
+      </w:r>
+      <w:proofErr w:type="gramEnd"/>
+      <w:r>
+        <w:t xml:space="preserve"> pohon </w:t>
+      </w:r>
+      <w:proofErr w:type="gramStart"/>
+      <w:r>
+        <w:t>pilihan )</w:t>
+      </w:r>
+      <w:proofErr w:type="gramEnd"/>
+      <w:r>
+        <w:t xml:space="preserve">. Sistem menu tarik adalah sistem menu yang akan menampilkan pilihan dalam kelompok – kelompok tertentu. Pada sebuah sub pilihan/submenu dari suatu pilihan/menu utama dapat mempunyai satu atau lebih sub – sub pilihan, dan seterusnya. Contoh sistem menu tarik </w:t>
+      </w:r>
+      <w:proofErr w:type="gramStart"/>
+      <w:r>
+        <w:t>( pulldown</w:t>
+      </w:r>
+      <w:proofErr w:type="gramEnd"/>
+      <w:r>
+        <w:t xml:space="preserve"> ). </w:t>
       </w:r>
     </w:p>
     <w:p>
@@ -948,7 +1295,23 @@
         <w:t xml:space="preserve"> </w:t>
       </w:r>
       <w:r>
-        <w:t xml:space="preserve">Dialog berbasis bahasa alami ( Natural Language Interface ) </w:t>
+        <w:t xml:space="preserve">Dialog berbasis bahasa alami </w:t>
+      </w:r>
+      <w:proofErr w:type="gramStart"/>
+      <w:r>
+        <w:t>( Natural</w:t>
+      </w:r>
+      <w:proofErr w:type="gramEnd"/>
+      <w:r>
+        <w:t xml:space="preserve"> Language </w:t>
+      </w:r>
+      <w:proofErr w:type="gramStart"/>
+      <w:r>
+        <w:t>Interface )</w:t>
+      </w:r>
+      <w:proofErr w:type="gramEnd"/>
+      <w:r>
+        <w:t xml:space="preserve"> </w:t>
       </w:r>
     </w:p>
     <w:p>
@@ -956,9 +1319,54 @@
         <w:spacing w:after="99"/>
         <w:ind w:left="14" w:right="6"/>
       </w:pPr>
+      <w:proofErr w:type="gramStart"/>
       <w:r>
         <w:lastRenderedPageBreak/>
-        <w:t xml:space="preserve">“ Dialog yang berisikan instruksi – instruksi dalam bahasa alami ( manusia ) yang diterjemahkan oleh sistem penterjeman ”. Jika dialog berbasis perintah tunggal instruksinya sangat dibatasi oleh sintaksis yang digunakan. Dengan bahasa alami, pengguna dapat memberikan instruksinya dengna kalimat – kalimat yang lebih manusiawi. Kata – kata/bahasa sehari – hari bisa digunakan. Seperti DISPLAYALL  dalam dBase. Contoh : Dalam Bahasa Pascal : </w:t>
+        <w:t>“ Dialog</w:t>
+      </w:r>
+      <w:proofErr w:type="gramEnd"/>
+      <w:r>
+        <w:t xml:space="preserve"> yang berisikan instruksi – instruksi dalam bahasa alami </w:t>
+      </w:r>
+      <w:proofErr w:type="gramStart"/>
+      <w:r>
+        <w:t>( manusia</w:t>
+      </w:r>
+      <w:proofErr w:type="gramEnd"/>
+      <w:r>
+        <w:t xml:space="preserve"> ) yang diterjemahkan oleh sistem </w:t>
+      </w:r>
+      <w:proofErr w:type="gramStart"/>
+      <w:r>
+        <w:t>penterjeman ”</w:t>
+      </w:r>
+      <w:proofErr w:type="gramEnd"/>
+      <w:r>
+        <w:t xml:space="preserve">. Jika dialog berbasis perintah tunggal instruksinya sangat dibatasi oleh sintaksis yang digunakan. Dengan bahasa alami, pengguna dapat memberikan instruksinya dengna kalimat – kalimat yang lebih manusiawi. Kata – kata/bahasa sehari – hari bisa digunakan. Seperti </w:t>
+      </w:r>
+      <w:proofErr w:type="gramStart"/>
+      <w:r>
+        <w:t>DISPLAYALL  dalam</w:t>
+      </w:r>
+      <w:proofErr w:type="gramEnd"/>
+      <w:r>
+        <w:t xml:space="preserve"> dBase. </w:t>
+      </w:r>
+      <w:proofErr w:type="gramStart"/>
+      <w:r>
+        <w:t>Contoh :</w:t>
+      </w:r>
+      <w:proofErr w:type="gramEnd"/>
+      <w:r>
+        <w:t xml:space="preserve"> Dalam Bahasa </w:t>
+      </w:r>
+      <w:proofErr w:type="gramStart"/>
+      <w:r>
+        <w:t>Pascal :</w:t>
+      </w:r>
+      <w:proofErr w:type="gramEnd"/>
+      <w:r>
+        <w:t xml:space="preserve"> </w:t>
       </w:r>
     </w:p>
     <w:p>
@@ -993,7 +1401,15 @@
       </w:r>
       <w:r>
         <w:tab/>
-        <w:t xml:space="preserve">Readln(T,S); </w:t>
+        <w:t>Readln(</w:t>
+      </w:r>
+      <w:proofErr w:type="gramStart"/>
+      <w:r>
+        <w:t>T,S);</w:t>
+      </w:r>
+      <w:proofErr w:type="gramEnd"/>
+      <w:r>
+        <w:t xml:space="preserve"> </w:t>
       </w:r>
     </w:p>
     <w:p>
@@ -1011,7 +1427,15 @@
         <w:ind w:left="14" w:right="6"/>
       </w:pPr>
       <w:r>
-        <w:t xml:space="preserve">Writeln (namamahasiswa); </w:t>
+        <w:t>Writeln (namamahasiswa</w:t>
+      </w:r>
+      <w:proofErr w:type="gramStart"/>
+      <w:r>
+        <w:t>);</w:t>
+      </w:r>
+      <w:proofErr w:type="gramEnd"/>
+      <w:r>
+        <w:t xml:space="preserve"> </w:t>
       </w:r>
     </w:p>
     <w:p>
@@ -1019,8 +1443,56 @@
         <w:spacing w:after="97"/>
         <w:ind w:left="14" w:right="6"/>
       </w:pPr>
-      <w:r>
-        <w:t xml:space="preserve">End; </w:t>
+      <w:proofErr w:type="gramStart"/>
+      <w:r>
+        <w:t>End;</w:t>
+      </w:r>
+      <w:proofErr w:type="gramEnd"/>
+      <w:r>
+        <w:t xml:space="preserve"> </w:t>
+      </w:r>
+    </w:p>
+    <w:p>
+      <w:pPr>
+        <w:spacing w:after="97"/>
+        <w:ind w:left="14" w:right="6"/>
+      </w:pPr>
+      <w:r>
+        <w:drawing>
+          <wp:inline distT="0" distB="0" distL="0" distR="0" wp14:anchorId="13302B6D" wp14:editId="5E75BDFF">
+            <wp:extent cx="4151630" cy="2252345"/>
+            <wp:effectExtent l="0" t="0" r="1270" b="0"/>
+            <wp:docPr id="2078868083" name="Picture 1" descr="A screenshot of a computer code&#10;&#10;AI-generated content may be incorrect."/>
+            <wp:cNvGraphicFramePr>
+              <a:graphicFrameLocks xmlns:a="http://schemas.openxmlformats.org/drawingml/2006/main" noChangeAspect="1"/>
+            </wp:cNvGraphicFramePr>
+            <a:graphic xmlns:a="http://schemas.openxmlformats.org/drawingml/2006/main">
+              <a:graphicData uri="http://schemas.openxmlformats.org/drawingml/2006/picture">
+                <pic:pic xmlns:pic="http://schemas.openxmlformats.org/drawingml/2006/picture">
+                  <pic:nvPicPr>
+                    <pic:cNvPr id="2078868083" name="Picture 1" descr="A screenshot of a computer code&#10;&#10;AI-generated content may be incorrect."/>
+                    <pic:cNvPicPr/>
+                  </pic:nvPicPr>
+                  <pic:blipFill>
+                    <a:blip r:embed="rId16"/>
+                    <a:stretch>
+                      <a:fillRect/>
+                    </a:stretch>
+                  </pic:blipFill>
+                  <pic:spPr>
+                    <a:xfrm>
+                      <a:off x="0" y="0"/>
+                      <a:ext cx="4151630" cy="2252345"/>
+                    </a:xfrm>
+                    <a:prstGeom prst="rect">
+                      <a:avLst/>
+                    </a:prstGeom>
+                  </pic:spPr>
+                </pic:pic>
+              </a:graphicData>
+            </a:graphic>
+          </wp:inline>
+        </w:drawing>
       </w:r>
     </w:p>
     <w:p>
@@ -1050,7 +1522,39 @@
         <w:ind w:left="14" w:right="6"/>
       </w:pPr>
       <w:r>
-        <w:t xml:space="preserve">Sejauh dengan penggunaan simbol – simbol dan tanda – tanda kehidupan kita sehari – hari, antarmuka sering memanfaatkan simbol – simbol dan tanda – tanda ini untuk memberitahukan pengguna akan kemampuan dan fasilitas yang dimiliki oleh suatu program aplikasi. Ragam dialog yang banyak menggunakan simbol – simbol dan tanda – tanda untuk menunjukkan suatu aktivitas tertentu disebuh dengan antarmuka  berbasis ikon ( icon – based user interface ). ”Dialog yang menggunakan simbol atau tanda untuk menunjukkan suatu pilihan aktivitas tertentu”. </w:t>
+        <w:t xml:space="preserve">Sejauh dengan penggunaan simbol – simbol dan tanda – tanda kehidupan kita sehari – hari, antarmuka sering memanfaatkan simbol – simbol dan tanda – tanda ini untuk memberitahukan pengguna akan kemampuan dan fasilitas yang dimiliki oleh suatu program aplikasi. Ragam dialog yang banyak menggunakan simbol – simbol dan tanda – tanda untuk menunjukkan suatu aktivitas tertentu disebuh dengan </w:t>
+      </w:r>
+      <w:proofErr w:type="gramStart"/>
+      <w:r>
+        <w:t>antarmuka  berbasis</w:t>
+      </w:r>
+      <w:proofErr w:type="gramEnd"/>
+      <w:r>
+        <w:t xml:space="preserve"> ikon </w:t>
+      </w:r>
+      <w:proofErr w:type="gramStart"/>
+      <w:r>
+        <w:t>( icon</w:t>
+      </w:r>
+      <w:proofErr w:type="gramEnd"/>
+      <w:r>
+        <w:t xml:space="preserve"> – based user </w:t>
+      </w:r>
+      <w:proofErr w:type="gramStart"/>
+      <w:r>
+        <w:t>interface )</w:t>
+      </w:r>
+      <w:proofErr w:type="gramEnd"/>
+      <w:r>
+        <w:t xml:space="preserve">. </w:t>
+      </w:r>
+      <w:proofErr w:type="gramStart"/>
+      <w:r>
+        <w:t>”Dialog</w:t>
+      </w:r>
+      <w:proofErr w:type="gramEnd"/>
+      <w:r>
+        <w:t xml:space="preserve"> yang menggunakan simbol atau tanda untuk menunjukkan suatu pilihan aktivitas tertentu”. </w:t>
       </w:r>
     </w:p>
     <w:p>
@@ -1062,6 +1566,7 @@
         <w:rPr>
           <w:noProof/>
         </w:rPr>
+        <w:lastRenderedPageBreak/>
         <w:drawing>
           <wp:inline distT="0" distB="0" distL="0" distR="0" wp14:anchorId="518A3296" wp14:editId="35E92038">
             <wp:extent cx="4151630" cy="532130"/>
@@ -1078,7 +1583,7 @@
                     <pic:cNvPicPr/>
                   </pic:nvPicPr>
                   <pic:blipFill>
-                    <a:blip r:embed="rId15"/>
+                    <a:blip r:embed="rId17"/>
                     <a:stretch>
                       <a:fillRect/>
                     </a:stretch>
@@ -1114,9 +1619,11 @@
       <w:r>
         <w:t xml:space="preserve"> Antarmuka berbasis ikon (</w:t>
       </w:r>
+      <w:proofErr w:type="gramStart"/>
       <w:r>
         <w:t>Imanuel,Fridolf</w:t>
       </w:r>
+      <w:proofErr w:type="gramEnd"/>
       <w:r>
         <w:t>, 20</w:t>
       </w:r>
@@ -1146,7 +1653,15 @@
         <w:ind w:left="14" w:right="6"/>
       </w:pPr>
       <w:r>
-        <w:t xml:space="preserve">“Sistem antarmuka yang memungkinkan pengguna untuk menampilkan berbagai informasi pada satu atau lebih jendela( window)”. </w:t>
+        <w:t xml:space="preserve">“Sistem antarmuka yang memungkinkan pengguna untuk menampilkan berbagai informasi pada satu atau lebih </w:t>
+      </w:r>
+      <w:proofErr w:type="gramStart"/>
+      <w:r>
+        <w:t>jendela( window</w:t>
+      </w:r>
+      <w:proofErr w:type="gramEnd"/>
+      <w:r>
+        <w:t xml:space="preserve">)”. </w:t>
       </w:r>
     </w:p>
     <w:p>
@@ -1155,7 +1670,15 @@
         <w:ind w:left="14" w:right="6"/>
       </w:pPr>
       <w:r>
-        <w:t xml:space="preserve">Langkah pertama yang harus dilakukan perancang tampilan adalah mengidentifikasikan tugas – tugas atau pekerjaan – pekerjaan yang sekiranya dapat diselesaikan menggunakan sistem penjendelaan. Tugas – tugas atau pekerjaan – pekerjaan yang dapat dilakukan dengan memanfaatkan sistem penjendelaan antara lain adalah : </w:t>
+        <w:t xml:space="preserve">Langkah pertama yang harus dilakukan perancang tampilan adalah mengidentifikasikan tugas – tugas atau pekerjaan – pekerjaan yang sekiranya dapat diselesaikan menggunakan sistem penjendelaan. Tugas – tugas atau pekerjaan – pekerjaan yang dapat dilakukan dengan memanfaatkan sistem penjendelaan antara lain </w:t>
+      </w:r>
+      <w:proofErr w:type="gramStart"/>
+      <w:r>
+        <w:t>adalah :</w:t>
+      </w:r>
+      <w:proofErr w:type="gramEnd"/>
+      <w:r>
+        <w:t xml:space="preserve"> </w:t>
       </w:r>
     </w:p>
     <w:p>
@@ -1164,7 +1687,6 @@
         <w:ind w:left="14" w:right="6"/>
       </w:pPr>
       <w:r>
-        <w:lastRenderedPageBreak/>
         <w:t xml:space="preserve">a. </w:t>
       </w:r>
       <w:r>
@@ -1236,7 +1758,23 @@
         <w:ind w:right="6" w:hanging="360"/>
       </w:pPr>
       <w:r>
-        <w:t xml:space="preserve">Penyajian jamak ( multiple view ) </w:t>
+        <w:t xml:space="preserve">Penyajian jamak </w:t>
+      </w:r>
+      <w:proofErr w:type="gramStart"/>
+      <w:r>
+        <w:t>( multiple</w:t>
+      </w:r>
+      <w:proofErr w:type="gramEnd"/>
+      <w:r>
+        <w:t xml:space="preserve"> </w:t>
+      </w:r>
+      <w:proofErr w:type="gramStart"/>
+      <w:r>
+        <w:t>view )</w:t>
+      </w:r>
+      <w:proofErr w:type="gramEnd"/>
+      <w:r>
+        <w:t xml:space="preserve"> </w:t>
       </w:r>
     </w:p>
     <w:p>
@@ -1274,7 +1812,23 @@
         <w:t xml:space="preserve"> </w:t>
       </w:r>
       <w:r>
-        <w:t xml:space="preserve">Jenis – jenis jendela ( window ) : </w:t>
+        <w:t xml:space="preserve">Jenis – jenis jendela </w:t>
+      </w:r>
+      <w:proofErr w:type="gramStart"/>
+      <w:r>
+        <w:t>( window</w:t>
+      </w:r>
+      <w:proofErr w:type="gramEnd"/>
+      <w:r>
+        <w:t xml:space="preserve"> </w:t>
+      </w:r>
+      <w:proofErr w:type="gramStart"/>
+      <w:r>
+        <w:t>) :</w:t>
+      </w:r>
+      <w:proofErr w:type="gramEnd"/>
+      <w:r>
+        <w:t xml:space="preserve"> </w:t>
       </w:r>
     </w:p>
     <w:p>
@@ -1286,7 +1840,23 @@
         <w:ind w:right="6" w:hanging="360"/>
       </w:pPr>
       <w:r>
-        <w:t xml:space="preserve">Jendela TTY merupakan jenis jendela yang paling sederhana. Secara sekilas jendela ini mirip dengan tampilan apa adanya karena jendela TTY hanya terdiri atas sebuah jendela yang mempunyai fasilitas pemindahan halaman ( scrolling ) secara otomatis pada satu arah. Contoh jendela TTY adalah : dot prompt. </w:t>
+        <w:t xml:space="preserve">Jendela TTY merupakan jenis jendela yang paling sederhana. Secara sekilas jendela ini mirip dengan tampilan apa adanya karena jendela TTY hanya terdiri atas sebuah jendela yang mempunyai fasilitas pemindahan halaman </w:t>
+      </w:r>
+      <w:proofErr w:type="gramStart"/>
+      <w:r>
+        <w:t>( scrolling</w:t>
+      </w:r>
+      <w:proofErr w:type="gramEnd"/>
+      <w:r>
+        <w:t xml:space="preserve"> ) secara otomatis pada satu arah. Contoh jendela TTY </w:t>
+      </w:r>
+      <w:proofErr w:type="gramStart"/>
+      <w:r>
+        <w:t>adalah :</w:t>
+      </w:r>
+      <w:proofErr w:type="gramEnd"/>
+      <w:r>
+        <w:t xml:space="preserve"> dot prompt. </w:t>
       </w:r>
     </w:p>
     <w:p>
@@ -1299,6 +1869,7 @@
         <w:rPr>
           <w:noProof/>
         </w:rPr>
+        <w:lastRenderedPageBreak/>
         <w:drawing>
           <wp:inline distT="0" distB="0" distL="0" distR="0" wp14:anchorId="0429039C" wp14:editId="1DC45947">
             <wp:extent cx="3178629" cy="2811780"/>
@@ -1315,7 +1886,7 @@
                     <pic:cNvPicPr/>
                   </pic:nvPicPr>
                   <pic:blipFill>
-                    <a:blip r:embed="rId16"/>
+                    <a:blip r:embed="rId18"/>
                     <a:stretch>
                       <a:fillRect/>
                     </a:stretch>
@@ -1401,7 +1972,6 @@
         <w:rPr>
           <w:noProof/>
         </w:rPr>
-        <w:lastRenderedPageBreak/>
         <w:drawing>
           <wp:inline distT="0" distB="0" distL="0" distR="0" wp14:anchorId="5247902A" wp14:editId="6C817C52">
             <wp:extent cx="3320143" cy="1866755"/>
@@ -1418,7 +1988,7 @@
                     <pic:cNvPicPr/>
                   </pic:nvPicPr>
                   <pic:blipFill>
-                    <a:blip r:embed="rId17"/>
+                    <a:blip r:embed="rId19"/>
                     <a:stretch>
                       <a:fillRect/>
                     </a:stretch>
@@ -1452,8 +2022,13 @@
         <w:t>Gambar 4.4:</w:t>
       </w:r>
       <w:r>
-        <w:t xml:space="preserve"> Contoh Jendela Multilplexed(</w:t>
-      </w:r>
+        <w:t xml:space="preserve"> Contoh Jendela </w:t>
+      </w:r>
+      <w:proofErr w:type="gramStart"/>
+      <w:r>
+        <w:t>Multilplexed(</w:t>
+      </w:r>
+      <w:proofErr w:type="gramEnd"/>
       <w:r>
         <w:t>Imanuel</w:t>
       </w:r>
@@ -1492,7 +2067,11 @@
         <w:ind w:left="14" w:right="6"/>
       </w:pPr>
       <w:r>
-        <w:t xml:space="preserve">Dalam space – multiplexed Windows, lebar layar dibagi- bagi menjadi beberapa jendela dengan ukuran yang bervariasi, dan jenis jendelanya dapat ditentukan berdasarkan ketergantungan antara satu bisa diletakkan “diatas” jendela yang lain, dan apakah masing – masing jendela bisa diubah ukurannya. Jenis – jenis jendela yang tergolong dalam kelompok ini adalah jendela satu dimensi, jendela dua dimensi dan jendela dua setengah dimnesi. Jenndela satu dimensi adalah jenis jendela di mana layar dapat dibagi menjadi beberaoa bagian secara vertikal atau horizontal yang masing – masing dapat diubah ukurannya, maka jendela juga kan berubah. Jendela – jendela yang termasykj dalam jendela satu dimensi antara jendela yang satu dengan jendela yang lainnya tidak dapat saling tumpangtindih. Pada jendela dua dimensi, lebar layar dapat dibagi menjadi beberapa jendela baik arah vertikal maupun horizontal, sehingga seolah – olah membentuk tabel dari beberapa buah jendela. Meskipun layar isa dibagi – bagi ke arah vertikal maupun horizontal, tetapi antara satu jendela dengan jendela lainnya tidak dapat saling tumpang tindih. Sedangkan jendela dua setangah dimensi, pada prinsipnya sama dengan jendela dua dimnesi, tetapi mempunyai kelebihan bahwa jendela yang ada bisa saling tumpang tindih tanpa mengganggu informasi yang ada pada jendela yang lain. </w:t>
+        <w:t xml:space="preserve">Dalam space – multiplexed Windows, lebar layar dibagi- bagi menjadi beberapa jendela dengan ukuran yang bervariasi, dan jenis jendelanya </w:t>
+      </w:r>
+      <w:r>
+        <w:lastRenderedPageBreak/>
+        <w:t xml:space="preserve">dapat ditentukan berdasarkan ketergantungan antara satu bisa diletakkan “diatas” jendela yang lain, dan apakah masing – masing jendela bisa diubah ukurannya. Jenis – jenis jendela yang tergolong dalam kelompok ini adalah jendela satu dimensi, jendela dua dimensi dan jendela dua setengah dimnesi. Jenndela satu dimensi adalah jenis jendela di mana layar dapat dibagi menjadi beberaoa bagian secara vertikal atau horizontal yang masing – masing dapat diubah ukurannya, maka jendela juga kan berubah. Jendela – jendela yang termasykj dalam jendela satu dimensi antara jendela yang satu dengan jendela yang lainnya tidak dapat saling tumpangtindih. Pada jendela dua dimensi, lebar layar dapat dibagi menjadi beberapa jendela baik arah vertikal maupun horizontal, sehingga seolah – olah membentuk tabel dari beberapa buah jendela. Meskipun layar isa dibagi – bagi ke arah vertikal maupun horizontal, tetapi antara satu jendela dengan jendela lainnya tidak dapat saling tumpang tindih. Sedangkan jendela dua setangah dimensi, pada prinsipnya sama dengan jendela dua dimnesi, tetapi mempunyai kelebihan bahwa jendela yang ada bisa saling tumpang tindih tanpa mengganggu informasi yang ada pada jendela yang lain. </w:t>
       </w:r>
     </w:p>
     <w:p>
@@ -1513,11 +2092,7 @@
         <w:ind w:left="14" w:right="6"/>
       </w:pPr>
       <w:r>
-        <w:t xml:space="preserve">Jendela non homogen adalah jenis jendela yag tidak dapat dikelompokkan pada jenis jendela diatas. Dua dari beberapa jenis jendela homogen adalah ikon, dan zooming window. Pada zooming window, pengguna dapat melihat bagian tertentu dari objhek yang diamati secara lebih terinci, </w:t>
-      </w:r>
-      <w:r>
-        <w:lastRenderedPageBreak/>
-        <w:t xml:space="preserve">karena jendela ini dapat di perbesar maupun diperkecil sesuai dengan kebutuhan. </w:t>
+        <w:t xml:space="preserve">Jendela non homogen adalah jenis jendela yag tidak dapat dikelompokkan pada jenis jendela diatas. Dua dari beberapa jenis jendela homogen adalah ikon, dan zooming window. Pada zooming window, pengguna dapat melihat bagian tertentu dari objhek yang diamati secara lebih terinci, karena jendela ini dapat di perbesar maupun diperkecil sesuai dengan kebutuhan. </w:t>
       </w:r>
     </w:p>
     <w:p>
@@ -1546,7 +2121,7 @@
                     <pic:cNvPicPr/>
                   </pic:nvPicPr>
                   <pic:blipFill>
-                    <a:blip r:embed="rId18"/>
+                    <a:blip r:embed="rId20"/>
                     <a:stretch>
                       <a:fillRect/>
                     </a:stretch>
@@ -1580,8 +2155,13 @@
         <w:t>Gambar 4.5:</w:t>
       </w:r>
       <w:r>
-        <w:t xml:space="preserve"> Contoh Jendela Non Homogen(</w:t>
-      </w:r>
+        <w:t xml:space="preserve"> Contoh Jendela Non </w:t>
+      </w:r>
+      <w:proofErr w:type="gramStart"/>
+      <w:r>
+        <w:t>Homogen(</w:t>
+      </w:r>
+      <w:proofErr w:type="gramEnd"/>
       <w:r>
         <w:t>Imanuel, Fridolf</w:t>
       </w:r>
@@ -1596,6 +2176,7 @@
         <w:jc w:val="left"/>
       </w:pPr>
       <w:r>
+        <w:lastRenderedPageBreak/>
         <w:t xml:space="preserve"> </w:t>
       </w:r>
     </w:p>
@@ -1641,8 +2222,13 @@
         <w:ind w:left="30" w:right="0" w:hanging="19"/>
         <w:jc w:val="left"/>
       </w:pPr>
-      <w:r>
-        <w:t>Merupakan ”Penyajian langsung aktivitas kepada pengguna (user) sehingga aktivitas akan dikerjakan oleh komputer ketika pengguna memberikan instruksi langsung yang ada pada layar komputer”. b.</w:t>
+      <w:proofErr w:type="gramStart"/>
+      <w:r>
+        <w:t>Merupakan ”Penyajian</w:t>
+      </w:r>
+      <w:proofErr w:type="gramEnd"/>
+      <w:r>
+        <w:t xml:space="preserve"> langsung aktivitas kepada pengguna (user) sehingga aktivitas akan dikerjakan oleh komputer ketika pengguna memberikan instruksi langsung yang ada pada layar komputer”. b.</w:t>
       </w:r>
       <w:r>
         <w:rPr>
@@ -1734,8 +2320,21 @@
         <w:spacing w:after="54"/>
         <w:ind w:right="6" w:hanging="360"/>
       </w:pPr>
-      <w:r>
-        <w:t xml:space="preserve">( computer aided design ) </w:t>
+      <w:proofErr w:type="gramStart"/>
+      <w:r>
+        <w:t>( computer</w:t>
+      </w:r>
+      <w:proofErr w:type="gramEnd"/>
+      <w:r>
+        <w:t xml:space="preserve"> aided </w:t>
+      </w:r>
+      <w:proofErr w:type="gramStart"/>
+      <w:r>
+        <w:t>design )</w:t>
+      </w:r>
+      <w:proofErr w:type="gramEnd"/>
+      <w:r>
+        <w:t xml:space="preserve"> </w:t>
       </w:r>
     </w:p>
     <w:p>
@@ -1760,8 +2359,13 @@
       <w:pPr>
         <w:ind w:left="14" w:right="6"/>
       </w:pPr>
-      <w:r>
-        <w:t xml:space="preserve">”Dialog berbentuk pesan atau informasi pada suatu gambar atau link yang tampil ketika pengguna melakukan suatu aktivitas”. </w:t>
+      <w:proofErr w:type="gramStart"/>
+      <w:r>
+        <w:t>”Dialog</w:t>
+      </w:r>
+      <w:proofErr w:type="gramEnd"/>
+      <w:r>
+        <w:t xml:space="preserve"> berbentuk pesan atau informasi pada suatu gambar atau link yang tampil ketika pengguna melakukan suatu aktivitas”. </w:t>
       </w:r>
     </w:p>
     <w:p>
@@ -1774,7 +2378,6 @@
         <w:rPr>
           <w:noProof/>
         </w:rPr>
-        <w:lastRenderedPageBreak/>
         <w:drawing>
           <wp:inline distT="0" distB="0" distL="0" distR="0" wp14:anchorId="755B7CBA" wp14:editId="3546FE36">
             <wp:extent cx="4151630" cy="2334260"/>
@@ -1791,7 +2394,7 @@
                     <pic:cNvPicPr/>
                   </pic:nvPicPr>
                   <pic:blipFill>
-                    <a:blip r:embed="rId19"/>
+                    <a:blip r:embed="rId21"/>
                     <a:stretch>
                       <a:fillRect/>
                     </a:stretch>
@@ -1831,9 +2434,9 @@
         <w:ind w:left="121" w:right="6"/>
         <w:jc w:val="center"/>
         <w:sectPr>
-          <w:headerReference w:type="even" r:id="rId20"/>
-          <w:headerReference w:type="default" r:id="rId21"/>
-          <w:headerReference w:type="first" r:id="rId22"/>
+          <w:headerReference w:type="even" r:id="rId22"/>
+          <w:headerReference w:type="default" r:id="rId23"/>
+          <w:headerReference w:type="first" r:id="rId24"/>
           <w:pgSz w:w="9184" w:h="12983"/>
           <w:pgMar w:top="1091" w:right="1339" w:bottom="822" w:left="1307" w:header="760" w:footer="720" w:gutter="0"/>
           <w:cols w:space="720"/>
@@ -1864,9 +2467,9 @@
       </w:pPr>
     </w:p>
     <w:sectPr>
-      <w:headerReference w:type="even" r:id="rId23"/>
-      <w:headerReference w:type="default" r:id="rId24"/>
-      <w:headerReference w:type="first" r:id="rId25"/>
+      <w:headerReference w:type="even" r:id="rId25"/>
+      <w:headerReference w:type="default" r:id="rId26"/>
+      <w:headerReference w:type="first" r:id="rId27"/>
       <w:pgSz w:w="9184" w:h="12983"/>
       <w:pgMar w:top="1091" w:right="1337" w:bottom="804" w:left="1307" w:header="720" w:footer="720" w:gutter="0"/>
       <w:cols w:space="720"/>
@@ -1878,33 +2481,67 @@
 
 <file path=word/comments.xml><?xml version="1.0" encoding="utf-8"?>
 <w:comments xmlns:wpc="http://schemas.microsoft.com/office/word/2010/wordprocessingCanvas" xmlns:cx="http://schemas.microsoft.com/office/drawing/2014/chartex" xmlns:cx1="http://schemas.microsoft.com/office/drawing/2015/9/8/chartex" xmlns:cx2="http://schemas.microsoft.com/office/drawing/2015/10/21/chartex" xmlns:cx3="http://schemas.microsoft.com/office/drawing/2016/5/9/chartex" xmlns:cx4="http://schemas.microsoft.com/office/drawing/2016/5/10/chartex" xmlns:cx5="http://schemas.microsoft.com/office/drawing/2016/5/11/chartex" xmlns:cx6="http://schemas.microsoft.com/office/drawing/2016/5/12/chartex" xmlns:cx7="http://schemas.microsoft.com/office/drawing/2016/5/13/chartex" xmlns:cx8="http://schemas.microsoft.com/office/drawing/2016/5/14/chartex" xmlns:mc="http://schemas.openxmlformats.org/markup-compatibility/2006" xmlns:aink="http://schemas.microsoft.com/office/drawing/2016/ink" xmlns:am3d="http://schemas.microsoft.com/office/drawing/2017/model3d" xmlns:o="urn:schemas-microsoft-com:office:office" xmlns:oel="http://schemas.microsoft.com/office/2019/extlst" xmlns:r="http://schemas.openxmlformats.org/officeDocument/2006/relationships" xmlns:m="http://schemas.openxmlformats.org/officeDocument/2006/math" xmlns:v="urn:schemas-microsoft-com:vml" xmlns:wp14="http://schemas.microsoft.com/office/word/2010/wordprocessingDrawing" xmlns:wp="http://schemas.openxmlformats.org/drawingml/2006/wordprocessingDrawing" xmlns:w10="urn:schemas-microsoft-com:office:word" xmlns:w="http://schemas.openxmlformats.org/wordprocessingml/2006/main" xmlns:w14="http://schemas.microsoft.com/office/word/2010/wordml" xmlns:w15="http://schemas.microsoft.com/office/word/2012/wordml" xmlns:w16cex="http://schemas.microsoft.com/office/word/2018/wordml/cex" xmlns:w16cid="http://schemas.microsoft.com/office/word/2016/wordml/cid" xmlns:w16="http://schemas.microsoft.com/office/word/2018/wordml" xmlns:w16du="http://schemas.microsoft.com/office/word/2023/wordml/word16du" xmlns:w16sdtdh="http://schemas.microsoft.com/office/word/2020/wordml/sdtdatahash" xmlns:w16sdtfl="http://schemas.microsoft.com/office/word/2024/wordml/sdtformatlock" xmlns:w16se="http://schemas.microsoft.com/office/word/2015/wordml/symex" xmlns:wpg="http://schemas.microsoft.com/office/word/2010/wordprocessingGroup" xmlns:wpi="http://schemas.microsoft.com/office/word/2010/wordprocessingInk" xmlns:wne="http://schemas.microsoft.com/office/word/2006/wordml" xmlns:wps="http://schemas.microsoft.com/office/word/2010/wordprocessingShape" mc:Ignorable="w14 w15 w16se w16cid w16 w16cex w16sdtdh w16sdtfl w16du wp14">
-  <w:comment w:id="3" w:author="Ary Budi Warsito" w:date="2025-05-08T14:07:00Z" w:initials="AB">
+  <w:comment w:id="0" w:author="Ary Budi Warsito" w:date="2025-05-08T14:41:00Z" w:initials="AB">
     <w:p>
       <w:pPr>
-        <w:pStyle w:val="TeksKomentar"/>
+        <w:pStyle w:val="CommentText"/>
         <w:jc w:val="left"/>
       </w:pPr>
       <w:r>
         <w:rPr>
-          <w:rStyle w:val="ReferensiKomentar"/>
+          <w:rStyle w:val="CommentReference"/>
         </w:rPr>
         <w:annotationRef/>
       </w:r>
       <w:r>
-        <w:t>perbaiki</w:t>
+        <w:t>Revisi format tulisan</w:t>
       </w:r>
     </w:p>
   </w:comment>
-  <w:comment w:id="4" w:author="Priamansah Gulo" w:date="2025-05-08T14:31:00Z" w:initials="PG">
+  <w:comment w:id="4" w:author="Ary Budi Warsito" w:date="2025-05-08T14:07:00Z" w:initials="AB">
     <w:p>
       <w:pPr>
-        <w:pStyle w:val="TeksKomentar"/>
+        <w:pStyle w:val="CommentText"/>
+        <w:jc w:val="left"/>
       </w:pPr>
       <w:r>
         <w:rPr>
-          <w:rStyle w:val="ReferensiKomentar"/>
+          <w:rStyle w:val="CommentReference"/>
         </w:rPr>
         <w:annotationRef/>
+      </w:r>
+      <w:r>
+        <w:t>perbaiki</w:t>
+      </w:r>
+    </w:p>
+  </w:comment>
+  <w:comment w:id="5" w:author="Priamansah Gulo" w:date="2025-05-08T14:31:00Z" w:initials="PG">
+    <w:p>
+      <w:pPr>
+        <w:pStyle w:val="CommentText"/>
+      </w:pPr>
+      <w:r>
+        <w:rPr>
+          <w:rStyle w:val="CommentReference"/>
+        </w:rPr>
+        <w:annotationRef/>
+      </w:r>
+    </w:p>
+  </w:comment>
+  <w:comment w:id="6" w:author="Ary Budi Warsito" w:date="2025-05-08T14:42:00Z" w:initials="AB">
+    <w:p>
+      <w:pPr>
+        <w:pStyle w:val="CommentText"/>
+        <w:jc w:val="left"/>
+      </w:pPr>
+      <w:r>
+        <w:rPr>
+          <w:rStyle w:val="CommentReference"/>
+        </w:rPr>
+        <w:annotationRef/>
+      </w:r>
+      <w:r>
+        <w:t>perbaiki</w:t>
       </w:r>
     </w:p>
   </w:comment>
@@ -1913,22 +2550,28 @@
 
 <file path=word/commentsExtended.xml><?xml version="1.0" encoding="utf-8"?>
 <w15:commentsEx xmlns:wpc="http://schemas.microsoft.com/office/word/2010/wordprocessingCanvas" xmlns:cx="http://schemas.microsoft.com/office/drawing/2014/chartex" xmlns:cx1="http://schemas.microsoft.com/office/drawing/2015/9/8/chartex" xmlns:cx2="http://schemas.microsoft.com/office/drawing/2015/10/21/chartex" xmlns:cx3="http://schemas.microsoft.com/office/drawing/2016/5/9/chartex" xmlns:cx4="http://schemas.microsoft.com/office/drawing/2016/5/10/chartex" xmlns:cx5="http://schemas.microsoft.com/office/drawing/2016/5/11/chartex" xmlns:cx6="http://schemas.microsoft.com/office/drawing/2016/5/12/chartex" xmlns:cx7="http://schemas.microsoft.com/office/drawing/2016/5/13/chartex" xmlns:cx8="http://schemas.microsoft.com/office/drawing/2016/5/14/chartex" xmlns:mc="http://schemas.openxmlformats.org/markup-compatibility/2006" xmlns:aink="http://schemas.microsoft.com/office/drawing/2016/ink" xmlns:am3d="http://schemas.microsoft.com/office/drawing/2017/model3d" xmlns:o="urn:schemas-microsoft-com:office:office" xmlns:oel="http://schemas.microsoft.com/office/2019/extlst" xmlns:r="http://schemas.openxmlformats.org/officeDocument/2006/relationships" xmlns:m="http://schemas.openxmlformats.org/officeDocument/2006/math" xmlns:v="urn:schemas-microsoft-com:vml" xmlns:wp14="http://schemas.microsoft.com/office/word/2010/wordprocessingDrawing" xmlns:wp="http://schemas.openxmlformats.org/drawingml/2006/wordprocessingDrawing" xmlns:w10="urn:schemas-microsoft-com:office:word" xmlns:w="http://schemas.openxmlformats.org/wordprocessingml/2006/main" xmlns:w14="http://schemas.microsoft.com/office/word/2010/wordml" xmlns:w15="http://schemas.microsoft.com/office/word/2012/wordml" xmlns:w16cex="http://schemas.microsoft.com/office/word/2018/wordml/cex" xmlns:w16cid="http://schemas.microsoft.com/office/word/2016/wordml/cid" xmlns:w16="http://schemas.microsoft.com/office/word/2018/wordml" xmlns:w16du="http://schemas.microsoft.com/office/word/2023/wordml/word16du" xmlns:w16sdtdh="http://schemas.microsoft.com/office/word/2020/wordml/sdtdatahash" xmlns:w16sdtfl="http://schemas.microsoft.com/office/word/2024/wordml/sdtformatlock" xmlns:w16se="http://schemas.microsoft.com/office/word/2015/wordml/symex" xmlns:wpg="http://schemas.microsoft.com/office/word/2010/wordprocessingGroup" xmlns:wpi="http://schemas.microsoft.com/office/word/2010/wordprocessingInk" xmlns:wne="http://schemas.microsoft.com/office/word/2006/wordml" xmlns:wps="http://schemas.microsoft.com/office/word/2010/wordprocessingShape" mc:Ignorable="w14 w15 w16se w16cid w16 w16cex w16sdtdh w16sdtfl w16du wp14">
+  <w15:commentEx w15:paraId="7D688EFE" w15:done="0"/>
   <w15:commentEx w15:paraId="4DF2B949" w15:done="0"/>
   <w15:commentEx w15:paraId="4787FCC1" w15:paraIdParent="4DF2B949" w15:done="0"/>
+  <w15:commentEx w15:paraId="32D06777" w15:paraIdParent="4DF2B949" w15:done="0"/>
 </w15:commentsEx>
 </file>
 
 <file path=word/commentsExtensible.xml><?xml version="1.0" encoding="utf-8"?>
 <w16cex:commentsExtensible xmlns:wpc="http://schemas.microsoft.com/office/word/2010/wordprocessingCanvas" xmlns:cx="http://schemas.microsoft.com/office/drawing/2014/chartex" xmlns:cx1="http://schemas.microsoft.com/office/drawing/2015/9/8/chartex" xmlns:cx2="http://schemas.microsoft.com/office/drawing/2015/10/21/chartex" xmlns:cx3="http://schemas.microsoft.com/office/drawing/2016/5/9/chartex" xmlns:cx4="http://schemas.microsoft.com/office/drawing/2016/5/10/chartex" xmlns:cx5="http://schemas.microsoft.com/office/drawing/2016/5/11/chartex" xmlns:cx6="http://schemas.microsoft.com/office/drawing/2016/5/12/chartex" xmlns:cx7="http://schemas.microsoft.com/office/drawing/2016/5/13/chartex" xmlns:cx8="http://schemas.microsoft.com/office/drawing/2016/5/14/chartex" xmlns:cr="http://schemas.microsoft.com/office/comments/2020/reactions" xmlns:mc="http://schemas.openxmlformats.org/markup-compatibility/2006" xmlns:aink="http://schemas.microsoft.com/office/drawing/2016/ink" xmlns:am3d="http://schemas.microsoft.com/office/drawing/2017/model3d" xmlns:o="urn:schemas-microsoft-com:office:office" xmlns:oel="http://schemas.microsoft.com/office/2019/extlst" xmlns:r="http://schemas.openxmlformats.org/officeDocument/2006/relationships" xmlns:m="http://schemas.openxmlformats.org/officeDocument/2006/math" xmlns:v="urn:schemas-microsoft-com:vml" xmlns:wp14="http://schemas.microsoft.com/office/word/2010/wordprocessingDrawing" xmlns:wp="http://schemas.openxmlformats.org/drawingml/2006/wordprocessingDrawing" xmlns:w10="urn:schemas-microsoft-com:office:word" xmlns:w="http://schemas.openxmlformats.org/wordprocessingml/2006/main" xmlns:w14="http://schemas.microsoft.com/office/word/2010/wordml" xmlns:w15="http://schemas.microsoft.com/office/word/2012/wordml" xmlns:w16cex="http://schemas.microsoft.com/office/word/2018/wordml/cex" xmlns:w16cid="http://schemas.microsoft.com/office/word/2016/wordml/cid" xmlns:w16="http://schemas.microsoft.com/office/word/2018/wordml" xmlns:w16du="http://schemas.microsoft.com/office/word/2023/wordml/word16du" xmlns:w16sdtdh="http://schemas.microsoft.com/office/word/2020/wordml/sdtdatahash" xmlns:w16sdtfl="http://schemas.microsoft.com/office/word/2024/wordml/sdtformatlock" xmlns:w16se="http://schemas.microsoft.com/office/word/2015/wordml/symex" xmlns:wpg="http://schemas.microsoft.com/office/word/2010/wordprocessingGroup" xmlns:wpi="http://schemas.microsoft.com/office/word/2010/wordprocessingInk" xmlns:wne="http://schemas.microsoft.com/office/word/2006/wordml" xmlns:wps="http://schemas.microsoft.com/office/word/2010/wordprocessingShape" mc:Ignorable="w14 w15 w16se w16cid w16 w16cex w16sdtdh w16sdtfl cr w16du wp14">
+  <w16cex:commentExtensible w16cex:durableId="512621E8" w16cex:dateUtc="2025-05-08T07:41:00Z"/>
   <w16cex:commentExtensible w16cex:durableId="4B58F6BF" w16cex:dateUtc="2025-05-08T07:07:00Z"/>
   <w16cex:commentExtensible w16cex:durableId="48384907" w16cex:dateUtc="2025-05-08T07:31:00Z"/>
+  <w16cex:commentExtensible w16cex:durableId="5B35C780" w16cex:dateUtc="2025-05-08T07:42:00Z"/>
 </w16cex:commentsExtensible>
 </file>
 
 <file path=word/commentsIds.xml><?xml version="1.0" encoding="utf-8"?>
 <w16cid:commentsIds xmlns:wpc="http://schemas.microsoft.com/office/word/2010/wordprocessingCanvas" xmlns:cx="http://schemas.microsoft.com/office/drawing/2014/chartex" xmlns:cx1="http://schemas.microsoft.com/office/drawing/2015/9/8/chartex" xmlns:cx2="http://schemas.microsoft.com/office/drawing/2015/10/21/chartex" xmlns:cx3="http://schemas.microsoft.com/office/drawing/2016/5/9/chartex" xmlns:cx4="http://schemas.microsoft.com/office/drawing/2016/5/10/chartex" xmlns:cx5="http://schemas.microsoft.com/office/drawing/2016/5/11/chartex" xmlns:cx6="http://schemas.microsoft.com/office/drawing/2016/5/12/chartex" xmlns:cx7="http://schemas.microsoft.com/office/drawing/2016/5/13/chartex" xmlns:cx8="http://schemas.microsoft.com/office/drawing/2016/5/14/chartex" xmlns:mc="http://schemas.openxmlformats.org/markup-compatibility/2006" xmlns:aink="http://schemas.microsoft.com/office/drawing/2016/ink" xmlns:am3d="http://schemas.microsoft.com/office/drawing/2017/model3d" xmlns:o="urn:schemas-microsoft-com:office:office" xmlns:oel="http://schemas.microsoft.com/office/2019/extlst" xmlns:r="http://schemas.openxmlformats.org/officeDocument/2006/relationships" xmlns:m="http://schemas.openxmlformats.org/officeDocument/2006/math" xmlns:v="urn:schemas-microsoft-com:vml" xmlns:wp14="http://schemas.microsoft.com/office/word/2010/wordprocessingDrawing" xmlns:wp="http://schemas.openxmlformats.org/drawingml/2006/wordprocessingDrawing" xmlns:w10="urn:schemas-microsoft-com:office:word" xmlns:w="http://schemas.openxmlformats.org/wordprocessingml/2006/main" xmlns:w14="http://schemas.microsoft.com/office/word/2010/wordml" xmlns:w15="http://schemas.microsoft.com/office/word/2012/wordml" xmlns:w16cex="http://schemas.microsoft.com/office/word/2018/wordml/cex" xmlns:w16cid="http://schemas.microsoft.com/office/word/2016/wordml/cid" xmlns:w16="http://schemas.microsoft.com/office/word/2018/wordml" xmlns:w16du="http://schemas.microsoft.com/office/word/2023/wordml/word16du" xmlns:w16sdtdh="http://schemas.microsoft.com/office/word/2020/wordml/sdtdatahash" xmlns:w16sdtfl="http://schemas.microsoft.com/office/word/2024/wordml/sdtformatlock" xmlns:w16se="http://schemas.microsoft.com/office/word/2015/wordml/symex" xmlns:wpg="http://schemas.microsoft.com/office/word/2010/wordprocessingGroup" xmlns:wpi="http://schemas.microsoft.com/office/word/2010/wordprocessingInk" xmlns:wne="http://schemas.microsoft.com/office/word/2006/wordml" xmlns:wps="http://schemas.microsoft.com/office/word/2010/wordprocessingShape" mc:Ignorable="w14 w15 w16se w16cid w16 w16cex w16sdtdh w16sdtfl w16du wp14">
+  <w16cid:commentId w16cid:paraId="7D688EFE" w16cid:durableId="512621E8"/>
   <w16cid:commentId w16cid:paraId="4DF2B949" w16cid:durableId="4B58F6BF"/>
   <w16cid:commentId w16cid:paraId="4787FCC1" w16cid:durableId="48384907"/>
+  <w16cid:commentId w16cid:paraId="32D06777" w16cid:durableId="5B35C780"/>
 </w16cid:commentsIds>
 </file>
 
@@ -13927,10 +14570,10 @@
       <w:lang w:val="en-US" w:eastAsia="en-US" w:bidi="en-US"/>
     </w:rPr>
   </w:style>
-  <w:style w:type="paragraph" w:styleId="Judul1">
+  <w:style w:type="paragraph" w:styleId="Heading1">
     <w:name w:val="heading 1"/>
     <w:next w:val="Normal"/>
-    <w:link w:val="Judul1KAR"/>
+    <w:link w:val="Heading1Char"/>
     <w:uiPriority w:val="9"/>
     <w:qFormat/>
     <w:pPr>
@@ -13946,10 +14589,10 @@
       <w:color w:val="000000"/>
     </w:rPr>
   </w:style>
-  <w:style w:type="paragraph" w:styleId="Judul2">
+  <w:style w:type="paragraph" w:styleId="Heading2">
     <w:name w:val="heading 2"/>
     <w:next w:val="Normal"/>
-    <w:link w:val="Judul2KAR"/>
+    <w:link w:val="Heading2Char"/>
     <w:uiPriority w:val="9"/>
     <w:unhideWhenUsed/>
     <w:qFormat/>
@@ -13966,10 +14609,10 @@
       <w:sz w:val="25"/>
     </w:rPr>
   </w:style>
-  <w:style w:type="paragraph" w:styleId="Judul3">
+  <w:style w:type="paragraph" w:styleId="Heading3">
     <w:name w:val="heading 3"/>
     <w:next w:val="Normal"/>
-    <w:link w:val="Judul3KAR"/>
+    <w:link w:val="Heading3Char"/>
     <w:uiPriority w:val="9"/>
     <w:unhideWhenUsed/>
     <w:qFormat/>
@@ -13986,10 +14629,10 @@
       <w:sz w:val="25"/>
     </w:rPr>
   </w:style>
-  <w:style w:type="paragraph" w:styleId="Judul4">
+  <w:style w:type="paragraph" w:styleId="Heading4">
     <w:name w:val="heading 4"/>
     <w:next w:val="Normal"/>
-    <w:link w:val="Judul4KAR"/>
+    <w:link w:val="Heading4Char"/>
     <w:uiPriority w:val="9"/>
     <w:unhideWhenUsed/>
     <w:qFormat/>
@@ -14006,10 +14649,10 @@
       <w:sz w:val="25"/>
     </w:rPr>
   </w:style>
-  <w:style w:type="paragraph" w:styleId="Judul5">
+  <w:style w:type="paragraph" w:styleId="Heading5">
     <w:name w:val="heading 5"/>
     <w:next w:val="Normal"/>
-    <w:link w:val="Judul5KAR"/>
+    <w:link w:val="Heading5Char"/>
     <w:uiPriority w:val="9"/>
     <w:unhideWhenUsed/>
     <w:qFormat/>
@@ -14026,10 +14669,10 @@
       <w:sz w:val="25"/>
     </w:rPr>
   </w:style>
-  <w:style w:type="paragraph" w:styleId="Judul6">
+  <w:style w:type="paragraph" w:styleId="Heading6">
     <w:name w:val="heading 6"/>
     <w:next w:val="Normal"/>
-    <w:link w:val="Judul6KAR"/>
+    <w:link w:val="Heading6Char"/>
     <w:uiPriority w:val="9"/>
     <w:unhideWhenUsed/>
     <w:qFormat/>
@@ -14046,10 +14689,10 @@
       <w:u w:val="single" w:color="000000"/>
     </w:rPr>
   </w:style>
-  <w:style w:type="paragraph" w:styleId="Judul7">
+  <w:style w:type="paragraph" w:styleId="Heading7">
     <w:name w:val="heading 7"/>
     <w:next w:val="Normal"/>
-    <w:link w:val="Judul7KAR"/>
+    <w:link w:val="Heading7Char"/>
     <w:uiPriority w:val="9"/>
     <w:unhideWhenUsed/>
     <w:qFormat/>
@@ -14066,13 +14709,13 @@
       <w:u w:val="single" w:color="000000"/>
     </w:rPr>
   </w:style>
-  <w:style w:type="character" w:default="1" w:styleId="FontParagrafDefault">
+  <w:style w:type="character" w:default="1" w:styleId="DefaultParagraphFont">
     <w:name w:val="Default Paragraph Font"/>
     <w:uiPriority w:val="1"/>
     <w:semiHidden/>
     <w:unhideWhenUsed/>
   </w:style>
-  <w:style w:type="table" w:default="1" w:styleId="TabelNormal">
+  <w:style w:type="table" w:default="1" w:styleId="TableNormal">
     <w:name w:val="Normal Table"/>
     <w:uiPriority w:val="99"/>
     <w:semiHidden/>
@@ -14087,15 +14730,15 @@
       </w:tblCellMar>
     </w:tblPr>
   </w:style>
-  <w:style w:type="numbering" w:default="1" w:styleId="TidakAdaDaftar">
+  <w:style w:type="numbering" w:default="1" w:styleId="NoList">
     <w:name w:val="No List"/>
     <w:uiPriority w:val="99"/>
     <w:semiHidden/>
     <w:unhideWhenUsed/>
   </w:style>
-  <w:style w:type="character" w:customStyle="1" w:styleId="Judul6KAR">
-    <w:name w:val="Judul 6 KAR"/>
-    <w:link w:val="Judul6"/>
+  <w:style w:type="character" w:customStyle="1" w:styleId="Heading6Char">
+    <w:name w:val="Heading 6 Char"/>
+    <w:link w:val="Heading6"/>
     <w:rPr>
       <w:rFonts w:ascii="Times New Roman" w:eastAsia="Times New Roman" w:hAnsi="Times New Roman" w:cs="Times New Roman"/>
       <w:color w:val="000000"/>
@@ -14103,9 +14746,9 @@
       <w:u w:val="single" w:color="000000"/>
     </w:rPr>
   </w:style>
-  <w:style w:type="character" w:customStyle="1" w:styleId="Judul7KAR">
-    <w:name w:val="Judul 7 KAR"/>
-    <w:link w:val="Judul7"/>
+  <w:style w:type="character" w:customStyle="1" w:styleId="Heading7Char">
+    <w:name w:val="Heading 7 Char"/>
+    <w:link w:val="Heading7"/>
     <w:rPr>
       <w:rFonts w:ascii="Times New Roman" w:eastAsia="Times New Roman" w:hAnsi="Times New Roman" w:cs="Times New Roman"/>
       <w:color w:val="000000"/>
@@ -14113,45 +14756,45 @@
       <w:u w:val="single" w:color="000000"/>
     </w:rPr>
   </w:style>
-  <w:style w:type="character" w:customStyle="1" w:styleId="Judul4KAR">
-    <w:name w:val="Judul 4 KAR"/>
-    <w:link w:val="Judul4"/>
+  <w:style w:type="character" w:customStyle="1" w:styleId="Heading4Char">
+    <w:name w:val="Heading 4 Char"/>
+    <w:link w:val="Heading4"/>
     <w:rPr>
       <w:rFonts w:ascii="Calibri" w:eastAsia="Calibri" w:hAnsi="Calibri" w:cs="Calibri"/>
       <w:color w:val="000000"/>
       <w:sz w:val="25"/>
     </w:rPr>
   </w:style>
-  <w:style w:type="character" w:customStyle="1" w:styleId="Judul5KAR">
-    <w:name w:val="Judul 5 KAR"/>
-    <w:link w:val="Judul5"/>
+  <w:style w:type="character" w:customStyle="1" w:styleId="Heading5Char">
+    <w:name w:val="Heading 5 Char"/>
+    <w:link w:val="Heading5"/>
     <w:rPr>
       <w:rFonts w:ascii="Calibri" w:eastAsia="Calibri" w:hAnsi="Calibri" w:cs="Calibri"/>
       <w:color w:val="000000"/>
       <w:sz w:val="25"/>
     </w:rPr>
   </w:style>
-  <w:style w:type="character" w:customStyle="1" w:styleId="Judul1KAR">
-    <w:name w:val="Judul 1 KAR"/>
-    <w:link w:val="Judul1"/>
+  <w:style w:type="character" w:customStyle="1" w:styleId="Heading1Char">
+    <w:name w:val="Heading 1 Char"/>
+    <w:link w:val="Heading1"/>
     <w:rPr>
       <w:rFonts w:ascii="Times New Roman" w:eastAsia="Times New Roman" w:hAnsi="Times New Roman" w:cs="Times New Roman"/>
       <w:color w:val="000000"/>
       <w:sz w:val="22"/>
     </w:rPr>
   </w:style>
-  <w:style w:type="character" w:customStyle="1" w:styleId="Judul2KAR">
-    <w:name w:val="Judul 2 KAR"/>
-    <w:link w:val="Judul2"/>
+  <w:style w:type="character" w:customStyle="1" w:styleId="Heading2Char">
+    <w:name w:val="Heading 2 Char"/>
+    <w:link w:val="Heading2"/>
     <w:rPr>
       <w:rFonts w:ascii="Calibri" w:eastAsia="Calibri" w:hAnsi="Calibri" w:cs="Calibri"/>
       <w:color w:val="000000"/>
       <w:sz w:val="25"/>
     </w:rPr>
   </w:style>
-  <w:style w:type="character" w:customStyle="1" w:styleId="Judul3KAR">
-    <w:name w:val="Judul 3 KAR"/>
-    <w:link w:val="Judul3"/>
+  <w:style w:type="character" w:customStyle="1" w:styleId="Heading3Char">
+    <w:name w:val="Heading 3 Char"/>
+    <w:link w:val="Heading3"/>
     <w:rPr>
       <w:rFonts w:ascii="Calibri" w:eastAsia="Calibri" w:hAnsi="Calibri" w:cs="Calibri"/>
       <w:color w:val="000000"/>
@@ -14211,10 +14854,10 @@
       </w:tblCellMar>
     </w:tblPr>
   </w:style>
-  <w:style w:type="paragraph" w:styleId="TeksBalon">
+  <w:style w:type="paragraph" w:styleId="BalloonText">
     <w:name w:val="Balloon Text"/>
     <w:basedOn w:val="Normal"/>
-    <w:link w:val="TeksBalonKAR"/>
+    <w:link w:val="BalloonTextChar"/>
     <w:uiPriority w:val="99"/>
     <w:semiHidden/>
     <w:unhideWhenUsed/>
@@ -14228,10 +14871,10 @@
       <w:szCs w:val="18"/>
     </w:rPr>
   </w:style>
-  <w:style w:type="character" w:customStyle="1" w:styleId="TeksBalonKAR">
-    <w:name w:val="Teks Balon KAR"/>
-    <w:basedOn w:val="FontParagrafDefault"/>
-    <w:link w:val="TeksBalon"/>
+  <w:style w:type="character" w:customStyle="1" w:styleId="BalloonTextChar">
+    <w:name w:val="Balloon Text Char"/>
+    <w:basedOn w:val="DefaultParagraphFont"/>
+    <w:link w:val="BalloonText"/>
     <w:uiPriority w:val="99"/>
     <w:semiHidden/>
     <w:rsid w:val="005E2400"/>
@@ -14246,7 +14889,7 @@
   <w:style w:type="paragraph" w:styleId="Footer">
     <w:name w:val="footer"/>
     <w:basedOn w:val="Normal"/>
-    <w:link w:val="FooterKAR"/>
+    <w:link w:val="FooterChar"/>
     <w:uiPriority w:val="99"/>
     <w:unhideWhenUsed/>
     <w:rsid w:val="005E2400"/>
@@ -14258,9 +14901,9 @@
       <w:spacing w:after="0" w:line="240" w:lineRule="auto"/>
     </w:pPr>
   </w:style>
-  <w:style w:type="character" w:customStyle="1" w:styleId="FooterKAR">
-    <w:name w:val="Footer KAR"/>
-    <w:basedOn w:val="FontParagrafDefault"/>
+  <w:style w:type="character" w:customStyle="1" w:styleId="FooterChar">
+    <w:name w:val="Footer Char"/>
+    <w:basedOn w:val="DefaultParagraphFont"/>
     <w:link w:val="Footer"/>
     <w:uiPriority w:val="99"/>
     <w:rsid w:val="005E2400"/>
@@ -14270,9 +14913,9 @@
       <w:lang w:val="en-US" w:eastAsia="en-US" w:bidi="en-US"/>
     </w:rPr>
   </w:style>
-  <w:style w:type="character" w:styleId="ReferensiKomentar">
+  <w:style w:type="character" w:styleId="CommentReference">
     <w:name w:val="annotation reference"/>
-    <w:basedOn w:val="FontParagrafDefault"/>
+    <w:basedOn w:val="DefaultParagraphFont"/>
     <w:uiPriority w:val="99"/>
     <w:semiHidden/>
     <w:unhideWhenUsed/>
@@ -14282,10 +14925,10 @@
       <w:szCs w:val="16"/>
     </w:rPr>
   </w:style>
-  <w:style w:type="paragraph" w:styleId="TeksKomentar">
+  <w:style w:type="paragraph" w:styleId="CommentText">
     <w:name w:val="annotation text"/>
     <w:basedOn w:val="Normal"/>
-    <w:link w:val="TeksKomentarKAR"/>
+    <w:link w:val="CommentTextChar"/>
     <w:uiPriority w:val="99"/>
     <w:unhideWhenUsed/>
     <w:rsid w:val="00AC3579"/>
@@ -14297,10 +14940,10 @@
       <w:szCs w:val="20"/>
     </w:rPr>
   </w:style>
-  <w:style w:type="character" w:customStyle="1" w:styleId="TeksKomentarKAR">
-    <w:name w:val="Teks Komentar KAR"/>
-    <w:basedOn w:val="FontParagrafDefault"/>
-    <w:link w:val="TeksKomentar"/>
+  <w:style w:type="character" w:customStyle="1" w:styleId="CommentTextChar">
+    <w:name w:val="Comment Text Char"/>
+    <w:basedOn w:val="DefaultParagraphFont"/>
+    <w:link w:val="CommentText"/>
     <w:uiPriority w:val="99"/>
     <w:rsid w:val="00AC3579"/>
     <w:rPr>
@@ -14311,11 +14954,11 @@
       <w:lang w:val="en-US" w:eastAsia="en-US" w:bidi="en-US"/>
     </w:rPr>
   </w:style>
-  <w:style w:type="paragraph" w:styleId="SubjekKomentar">
+  <w:style w:type="paragraph" w:styleId="CommentSubject">
     <w:name w:val="annotation subject"/>
-    <w:basedOn w:val="TeksKomentar"/>
-    <w:next w:val="TeksKomentar"/>
-    <w:link w:val="SubjekKomentarKAR"/>
+    <w:basedOn w:val="CommentText"/>
+    <w:next w:val="CommentText"/>
+    <w:link w:val="CommentSubjectChar"/>
     <w:uiPriority w:val="99"/>
     <w:semiHidden/>
     <w:unhideWhenUsed/>
@@ -14325,10 +14968,10 @@
       <w:bCs/>
     </w:rPr>
   </w:style>
-  <w:style w:type="character" w:customStyle="1" w:styleId="SubjekKomentarKAR">
-    <w:name w:val="Subjek Komentar KAR"/>
-    <w:basedOn w:val="TeksKomentarKAR"/>
-    <w:link w:val="SubjekKomentar"/>
+  <w:style w:type="character" w:customStyle="1" w:styleId="CommentSubjectChar">
+    <w:name w:val="Comment Subject Char"/>
+    <w:basedOn w:val="CommentTextChar"/>
+    <w:link w:val="CommentSubject"/>
     <w:uiPriority w:val="99"/>
     <w:semiHidden/>
     <w:rsid w:val="00AC3579"/>
@@ -14638,4 +15281,16 @@
     </a:ext>
   </a:extLst>
 </a:theme>
+</file>
+
+<file path=customXml/item1.xml><?xml version="1.0" encoding="utf-8"?>
+<b:Sources xmlns:b="http://schemas.openxmlformats.org/officeDocument/2006/bibliography" xmlns="http://schemas.openxmlformats.org/officeDocument/2006/bibliography" SelectedStyle="\APASixthEditionOfficeOnline.xsl" StyleName="APA" Version="6"/>
+</file>
+
+<file path=customXml/itemProps1.xml><?xml version="1.0" encoding="utf-8"?>
+<ds:datastoreItem xmlns:ds="http://schemas.openxmlformats.org/officeDocument/2006/customXml" ds:itemID="{FD9068E2-EB83-4629-802D-425EDB994362}">
+  <ds:schemaRefs>
+    <ds:schemaRef ds:uri="http://schemas.openxmlformats.org/officeDocument/2006/bibliography"/>
+  </ds:schemaRefs>
+</ds:datastoreItem>
 </file>
</xml_diff>